<commit_message>
feat(refactor): test full test case of order service
</commit_message>
<xml_diff>
--- a/slot5/order-service/Test result order_service.docx
+++ b/slot5/order-service/Test result order_service.docx
@@ -4,6 +4,14 @@
   <w:body>
     <w:p>
       <w:r>
+        <w:t>Test case 1:</w:t>
+      </w:r>
+    </w:p>
+    <w:p>
+      <w:r>
+        <w:rPr>
+          <w:noProof/>
+        </w:rPr>
         <w:drawing>
           <wp:inline distT="0" distB="0" distL="0" distR="0" wp14:anchorId="422ABC67" wp14:editId="3E5A6D49">
             <wp:extent cx="5943600" cy="3131185"/>
@@ -29,6 +37,414 @@
                     <a:xfrm>
                       <a:off x="0" y="0"/>
                       <a:ext cx="5943600" cy="3131185"/>
+                    </a:xfrm>
+                    <a:prstGeom prst="rect">
+                      <a:avLst/>
+                    </a:prstGeom>
+                  </pic:spPr>
+                </pic:pic>
+              </a:graphicData>
+            </a:graphic>
+          </wp:inline>
+        </w:drawing>
+      </w:r>
+    </w:p>
+    <w:p/>
+    <w:p/>
+    <w:p>
+      <w:r>
+        <w:t>Test case 2:</w:t>
+      </w:r>
+    </w:p>
+    <w:p>
+      <w:r>
+        <w:drawing>
+          <wp:inline distT="0" distB="0" distL="0" distR="0" wp14:anchorId="1DA69BCF" wp14:editId="2EF91556">
+            <wp:extent cx="5943600" cy="3121025"/>
+            <wp:effectExtent l="0" t="0" r="0" b="3175"/>
+            <wp:docPr id="2" name="Picture 2"/>
+            <wp:cNvGraphicFramePr>
+              <a:graphicFrameLocks xmlns:a="http://schemas.openxmlformats.org/drawingml/2006/main" noChangeAspect="1"/>
+            </wp:cNvGraphicFramePr>
+            <a:graphic xmlns:a="http://schemas.openxmlformats.org/drawingml/2006/main">
+              <a:graphicData uri="http://schemas.openxmlformats.org/drawingml/2006/picture">
+                <pic:pic xmlns:pic="http://schemas.openxmlformats.org/drawingml/2006/picture">
+                  <pic:nvPicPr>
+                    <pic:cNvPr id="1" name=""/>
+                    <pic:cNvPicPr/>
+                  </pic:nvPicPr>
+                  <pic:blipFill>
+                    <a:blip r:embed="rId5"/>
+                    <a:stretch>
+                      <a:fillRect/>
+                    </a:stretch>
+                  </pic:blipFill>
+                  <pic:spPr>
+                    <a:xfrm>
+                      <a:off x="0" y="0"/>
+                      <a:ext cx="5943600" cy="3121025"/>
+                    </a:xfrm>
+                    <a:prstGeom prst="rect">
+                      <a:avLst/>
+                    </a:prstGeom>
+                  </pic:spPr>
+                </pic:pic>
+              </a:graphicData>
+            </a:graphic>
+          </wp:inline>
+        </w:drawing>
+      </w:r>
+    </w:p>
+    <w:p/>
+    <w:p/>
+    <w:p>
+      <w:r>
+        <w:lastRenderedPageBreak/>
+        <w:t>Test case 3:</w:t>
+      </w:r>
+    </w:p>
+    <w:p>
+      <w:r>
+        <w:drawing>
+          <wp:inline distT="0" distB="0" distL="0" distR="0" wp14:anchorId="2501054B" wp14:editId="69B72023">
+            <wp:extent cx="5943600" cy="3109595"/>
+            <wp:effectExtent l="0" t="0" r="0" b="0"/>
+            <wp:docPr id="3" name="Picture 3"/>
+            <wp:cNvGraphicFramePr>
+              <a:graphicFrameLocks xmlns:a="http://schemas.openxmlformats.org/drawingml/2006/main" noChangeAspect="1"/>
+            </wp:cNvGraphicFramePr>
+            <a:graphic xmlns:a="http://schemas.openxmlformats.org/drawingml/2006/main">
+              <a:graphicData uri="http://schemas.openxmlformats.org/drawingml/2006/picture">
+                <pic:pic xmlns:pic="http://schemas.openxmlformats.org/drawingml/2006/picture">
+                  <pic:nvPicPr>
+                    <pic:cNvPr id="1" name=""/>
+                    <pic:cNvPicPr/>
+                  </pic:nvPicPr>
+                  <pic:blipFill>
+                    <a:blip r:embed="rId6"/>
+                    <a:stretch>
+                      <a:fillRect/>
+                    </a:stretch>
+                  </pic:blipFill>
+                  <pic:spPr>
+                    <a:xfrm>
+                      <a:off x="0" y="0"/>
+                      <a:ext cx="5943600" cy="3109595"/>
+                    </a:xfrm>
+                    <a:prstGeom prst="rect">
+                      <a:avLst/>
+                    </a:prstGeom>
+                  </pic:spPr>
+                </pic:pic>
+              </a:graphicData>
+            </a:graphic>
+          </wp:inline>
+        </w:drawing>
+      </w:r>
+    </w:p>
+    <w:p>
+      <w:r>
+        <w:rPr>
+          <w:noProof/>
+        </w:rPr>
+        <w:drawing>
+          <wp:inline distT="0" distB="0" distL="0" distR="0" wp14:anchorId="2F3D6ADB" wp14:editId="2C663DB7">
+            <wp:extent cx="5943600" cy="1566545"/>
+            <wp:effectExtent l="0" t="0" r="0" b="0"/>
+            <wp:docPr id="4" name="Picture 4"/>
+            <wp:cNvGraphicFramePr>
+              <a:graphicFrameLocks xmlns:a="http://schemas.openxmlformats.org/drawingml/2006/main" noChangeAspect="1"/>
+            </wp:cNvGraphicFramePr>
+            <a:graphic xmlns:a="http://schemas.openxmlformats.org/drawingml/2006/main">
+              <a:graphicData uri="http://schemas.openxmlformats.org/drawingml/2006/picture">
+                <pic:pic xmlns:pic="http://schemas.openxmlformats.org/drawingml/2006/picture">
+                  <pic:nvPicPr>
+                    <pic:cNvPr id="1" name=""/>
+                    <pic:cNvPicPr/>
+                  </pic:nvPicPr>
+                  <pic:blipFill>
+                    <a:blip r:embed="rId7"/>
+                    <a:stretch>
+                      <a:fillRect/>
+                    </a:stretch>
+                  </pic:blipFill>
+                  <pic:spPr>
+                    <a:xfrm>
+                      <a:off x="0" y="0"/>
+                      <a:ext cx="5943600" cy="1566545"/>
+                    </a:xfrm>
+                    <a:prstGeom prst="rect">
+                      <a:avLst/>
+                    </a:prstGeom>
+                  </pic:spPr>
+                </pic:pic>
+              </a:graphicData>
+            </a:graphic>
+          </wp:inline>
+        </w:drawing>
+      </w:r>
+    </w:p>
+    <w:p/>
+    <w:p/>
+    <w:p/>
+    <w:p/>
+    <w:p/>
+    <w:p/>
+    <w:p/>
+    <w:p>
+      <w:r>
+        <w:t>Test case 4:</w:t>
+      </w:r>
+    </w:p>
+    <w:p>
+      <w:r>
+        <w:lastRenderedPageBreak/>
+        <w:drawing>
+          <wp:inline distT="0" distB="0" distL="0" distR="0" wp14:anchorId="5EC7E4B3" wp14:editId="38280ABD">
+            <wp:extent cx="5943600" cy="3137535"/>
+            <wp:effectExtent l="0" t="0" r="0" b="5715"/>
+            <wp:docPr id="5" name="Picture 5"/>
+            <wp:cNvGraphicFramePr>
+              <a:graphicFrameLocks xmlns:a="http://schemas.openxmlformats.org/drawingml/2006/main" noChangeAspect="1"/>
+            </wp:cNvGraphicFramePr>
+            <a:graphic xmlns:a="http://schemas.openxmlformats.org/drawingml/2006/main">
+              <a:graphicData uri="http://schemas.openxmlformats.org/drawingml/2006/picture">
+                <pic:pic xmlns:pic="http://schemas.openxmlformats.org/drawingml/2006/picture">
+                  <pic:nvPicPr>
+                    <pic:cNvPr id="1" name=""/>
+                    <pic:cNvPicPr/>
+                  </pic:nvPicPr>
+                  <pic:blipFill>
+                    <a:blip r:embed="rId8"/>
+                    <a:stretch>
+                      <a:fillRect/>
+                    </a:stretch>
+                  </pic:blipFill>
+                  <pic:spPr>
+                    <a:xfrm>
+                      <a:off x="0" y="0"/>
+                      <a:ext cx="5943600" cy="3137535"/>
+                    </a:xfrm>
+                    <a:prstGeom prst="rect">
+                      <a:avLst/>
+                    </a:prstGeom>
+                  </pic:spPr>
+                </pic:pic>
+              </a:graphicData>
+            </a:graphic>
+          </wp:inline>
+        </w:drawing>
+      </w:r>
+    </w:p>
+    <w:p/>
+    <w:p>
+      <w:r>
+        <w:t>Test case 5:</w:t>
+      </w:r>
+    </w:p>
+    <w:p>
+      <w:r>
+        <w:drawing>
+          <wp:inline distT="0" distB="0" distL="0" distR="0" wp14:anchorId="41FB98EE" wp14:editId="698EF18B">
+            <wp:extent cx="5943600" cy="3149600"/>
+            <wp:effectExtent l="0" t="0" r="0" b="0"/>
+            <wp:docPr id="6" name="Picture 6"/>
+            <wp:cNvGraphicFramePr>
+              <a:graphicFrameLocks xmlns:a="http://schemas.openxmlformats.org/drawingml/2006/main" noChangeAspect="1"/>
+            </wp:cNvGraphicFramePr>
+            <a:graphic xmlns:a="http://schemas.openxmlformats.org/drawingml/2006/main">
+              <a:graphicData uri="http://schemas.openxmlformats.org/drawingml/2006/picture">
+                <pic:pic xmlns:pic="http://schemas.openxmlformats.org/drawingml/2006/picture">
+                  <pic:nvPicPr>
+                    <pic:cNvPr id="1" name=""/>
+                    <pic:cNvPicPr/>
+                  </pic:nvPicPr>
+                  <pic:blipFill>
+                    <a:blip r:embed="rId9"/>
+                    <a:stretch>
+                      <a:fillRect/>
+                    </a:stretch>
+                  </pic:blipFill>
+                  <pic:spPr>
+                    <a:xfrm>
+                      <a:off x="0" y="0"/>
+                      <a:ext cx="5943600" cy="3149600"/>
+                    </a:xfrm>
+                    <a:prstGeom prst="rect">
+                      <a:avLst/>
+                    </a:prstGeom>
+                  </pic:spPr>
+                </pic:pic>
+              </a:graphicData>
+            </a:graphic>
+          </wp:inline>
+        </w:drawing>
+      </w:r>
+    </w:p>
+    <w:p/>
+    <w:p>
+      <w:r>
+        <w:t>Test case 6:</w:t>
+      </w:r>
+    </w:p>
+    <w:p>
+      <w:r>
+        <w:lastRenderedPageBreak/>
+        <w:drawing>
+          <wp:inline distT="0" distB="0" distL="0" distR="0" wp14:anchorId="29417193" wp14:editId="343A46E6">
+            <wp:extent cx="5943600" cy="3130550"/>
+            <wp:effectExtent l="0" t="0" r="0" b="0"/>
+            <wp:docPr id="7" name="Picture 7"/>
+            <wp:cNvGraphicFramePr>
+              <a:graphicFrameLocks xmlns:a="http://schemas.openxmlformats.org/drawingml/2006/main" noChangeAspect="1"/>
+            </wp:cNvGraphicFramePr>
+            <a:graphic xmlns:a="http://schemas.openxmlformats.org/drawingml/2006/main">
+              <a:graphicData uri="http://schemas.openxmlformats.org/drawingml/2006/picture">
+                <pic:pic xmlns:pic="http://schemas.openxmlformats.org/drawingml/2006/picture">
+                  <pic:nvPicPr>
+                    <pic:cNvPr id="1" name=""/>
+                    <pic:cNvPicPr/>
+                  </pic:nvPicPr>
+                  <pic:blipFill>
+                    <a:blip r:embed="rId10"/>
+                    <a:stretch>
+                      <a:fillRect/>
+                    </a:stretch>
+                  </pic:blipFill>
+                  <pic:spPr>
+                    <a:xfrm>
+                      <a:off x="0" y="0"/>
+                      <a:ext cx="5943600" cy="3130550"/>
+                    </a:xfrm>
+                    <a:prstGeom prst="rect">
+                      <a:avLst/>
+                    </a:prstGeom>
+                  </pic:spPr>
+                </pic:pic>
+              </a:graphicData>
+            </a:graphic>
+          </wp:inline>
+        </w:drawing>
+      </w:r>
+    </w:p>
+    <w:p>
+      <w:r>
+        <w:drawing>
+          <wp:inline distT="0" distB="0" distL="0" distR="0" wp14:anchorId="7C97A96B" wp14:editId="15C4BA80">
+            <wp:extent cx="5943600" cy="1499870"/>
+            <wp:effectExtent l="0" t="0" r="0" b="5080"/>
+            <wp:docPr id="8" name="Picture 8"/>
+            <wp:cNvGraphicFramePr>
+              <a:graphicFrameLocks xmlns:a="http://schemas.openxmlformats.org/drawingml/2006/main" noChangeAspect="1"/>
+            </wp:cNvGraphicFramePr>
+            <a:graphic xmlns:a="http://schemas.openxmlformats.org/drawingml/2006/main">
+              <a:graphicData uri="http://schemas.openxmlformats.org/drawingml/2006/picture">
+                <pic:pic xmlns:pic="http://schemas.openxmlformats.org/drawingml/2006/picture">
+                  <pic:nvPicPr>
+                    <pic:cNvPr id="1" name=""/>
+                    <pic:cNvPicPr/>
+                  </pic:nvPicPr>
+                  <pic:blipFill>
+                    <a:blip r:embed="rId11"/>
+                    <a:stretch>
+                      <a:fillRect/>
+                    </a:stretch>
+                  </pic:blipFill>
+                  <pic:spPr>
+                    <a:xfrm>
+                      <a:off x="0" y="0"/>
+                      <a:ext cx="5943600" cy="1499870"/>
+                    </a:xfrm>
+                    <a:prstGeom prst="rect">
+                      <a:avLst/>
+                    </a:prstGeom>
+                  </pic:spPr>
+                </pic:pic>
+              </a:graphicData>
+            </a:graphic>
+          </wp:inline>
+        </w:drawing>
+      </w:r>
+    </w:p>
+    <w:p/>
+    <w:p>
+      <w:r>
+        <w:t>Test case 7:</w:t>
+      </w:r>
+    </w:p>
+    <w:p>
+      <w:r>
+        <w:lastRenderedPageBreak/>
+        <w:drawing>
+          <wp:inline distT="0" distB="0" distL="0" distR="0" wp14:anchorId="5B2F05CE" wp14:editId="238EC2BF">
+            <wp:extent cx="5943600" cy="3124835"/>
+            <wp:effectExtent l="0" t="0" r="0" b="0"/>
+            <wp:docPr id="9" name="Picture 9"/>
+            <wp:cNvGraphicFramePr>
+              <a:graphicFrameLocks xmlns:a="http://schemas.openxmlformats.org/drawingml/2006/main" noChangeAspect="1"/>
+            </wp:cNvGraphicFramePr>
+            <a:graphic xmlns:a="http://schemas.openxmlformats.org/drawingml/2006/main">
+              <a:graphicData uri="http://schemas.openxmlformats.org/drawingml/2006/picture">
+                <pic:pic xmlns:pic="http://schemas.openxmlformats.org/drawingml/2006/picture">
+                  <pic:nvPicPr>
+                    <pic:cNvPr id="1" name=""/>
+                    <pic:cNvPicPr/>
+                  </pic:nvPicPr>
+                  <pic:blipFill>
+                    <a:blip r:embed="rId12"/>
+                    <a:stretch>
+                      <a:fillRect/>
+                    </a:stretch>
+                  </pic:blipFill>
+                  <pic:spPr>
+                    <a:xfrm>
+                      <a:off x="0" y="0"/>
+                      <a:ext cx="5943600" cy="3124835"/>
+                    </a:xfrm>
+                    <a:prstGeom prst="rect">
+                      <a:avLst/>
+                    </a:prstGeom>
+                  </pic:spPr>
+                </pic:pic>
+              </a:graphicData>
+            </a:graphic>
+          </wp:inline>
+        </w:drawing>
+      </w:r>
+    </w:p>
+    <w:p/>
+    <w:p>
+      <w:r>
+        <w:t>Test case 8:</w:t>
+      </w:r>
+    </w:p>
+    <w:p>
+      <w:r>
+        <w:drawing>
+          <wp:inline distT="0" distB="0" distL="0" distR="0" wp14:anchorId="14B29D21" wp14:editId="7D9C2C1B">
+            <wp:extent cx="5943600" cy="3115945"/>
+            <wp:effectExtent l="0" t="0" r="0" b="8255"/>
+            <wp:docPr id="10" name="Picture 10"/>
+            <wp:cNvGraphicFramePr>
+              <a:graphicFrameLocks xmlns:a="http://schemas.openxmlformats.org/drawingml/2006/main" noChangeAspect="1"/>
+            </wp:cNvGraphicFramePr>
+            <a:graphic xmlns:a="http://schemas.openxmlformats.org/drawingml/2006/main">
+              <a:graphicData uri="http://schemas.openxmlformats.org/drawingml/2006/picture">
+                <pic:pic xmlns:pic="http://schemas.openxmlformats.org/drawingml/2006/picture">
+                  <pic:nvPicPr>
+                    <pic:cNvPr id="1" name=""/>
+                    <pic:cNvPicPr/>
+                  </pic:nvPicPr>
+                  <pic:blipFill>
+                    <a:blip r:embed="rId13"/>
+                    <a:stretch>
+                      <a:fillRect/>
+                    </a:stretch>
+                  </pic:blipFill>
+                  <pic:spPr>
+                    <a:xfrm>
+                      <a:off x="0" y="0"/>
+                      <a:ext cx="5943600" cy="3115945"/>
                     </a:xfrm>
                     <a:prstGeom prst="rect">
                       <a:avLst/>

</xml_diff>